<commit_message>
feat(resume): Phase 2 — AI 다듬기 + 사진 업로드 (0039)
AI 다듬기 (lib/resume/polish.ts):
- Claude Sonnet 4.5 호출. "한국어 어색한 외국인" 톤 시스템 프롬프트.
- 매끄러운 윤문 금지 (담당자가 AI 의심 시 지원 거절될 위험).
- 학생 submit 시 자동 호출 → narrative_polished 저장. 실패 시 raw fallback.
- 관리자 재다듬기 액션 (regenerateResumePolish).

사진 (0039 + storage):
- 0039 migration: resume-photos private bucket (5MB / jpeg·png·webp).
- 공개 폼: 증명사진 input + 미리보기 + 교체. service_role 로 storage 업로드.
- docx 생성: docxtemplater-image-module-free 로 좌측 상단 (3×4cm) 자동 삽입.
  사진 없으면 빈 칸. 양식 t0[0,0] 의 placeholder {%photo} 로 매핑.

ResumeCard 확장:
- 제출 후 narrative 미리보기 (polished or raw) + AI 재다듬기 버튼.
- draft prop type 확장: data, photo_path.
</commit_message>
<xml_diff>
--- a/apps/admin/templates/resume-template.docx
+++ b/apps/admin/templates/resume-template.docx
@@ -45,7 +45,9 @@
             <w:pPr>
               <w:spacing w:after="120"/>
             </w:pPr>
-            <w:r/>
+            <w:r>
+              <w:t>{%photo}</w:t>
+            </w:r>
           </w:p>
         </w:tc>
         <w:tc>

</xml_diff>

<commit_message>
feat(resume): 표 열 너비 재분배 + fixed layout — 줄바꿈 최소화
각 표의 column 너비를 데이터 특성에 맞춰 재분배 + tblLayout=fixed
로 강제. word 가 cell 내용 따라 자동 조정 안 함.

- 학력 (5.5/4.0/4.0/3.5cm): 학교명 우선
- 경력 (3.5/2.5/2.5/6.5/2.0cm): 업무 상세 가장 넓게
- 자격증 (6.5/6.0/4.5cm): 명칭·발급기관 비슷하게
- 기술·어학 (4.5/8.5/4.0cm): 상세 가장 넓게
- 기타 활동 (4.0/3.5/3.0/6.5cm): 상세 가장 넓게

모두 합 17cm (양식 page content width).
</commit_message>
<xml_diff>
--- a/apps/admin/templates/resume-template.docx
+++ b/apps/admin/templates/resume-template.docx
@@ -244,6 +244,7 @@
         </w:tblBorders>
         <w:tblLook w:val="04A0" w:firstRow="1" w:lastRow="0" w:firstColumn="1" w:lastColumn="0" w:noHBand="0" w:noVBand="1"/>
         <w:jc w:val="center"/>
+        <w:tblLayout w:type="fixed"/>
       </w:tblPr>
       <w:tblGrid>
         <w:gridCol w:w="3800"/>
@@ -254,7 +255,7 @@
       <w:tr>
         <w:tc>
           <w:tcPr>
-            <w:tcW w:w="3800" w:type="dxa"/>
+            <w:tcW w:w="3118" w:type="dxa"/>
             <w:tcBorders>
               <w:top w:val="none"/>
               <w:left w:val="none"/>
@@ -288,7 +289,7 @@
         </w:tc>
         <w:tc>
           <w:tcPr>
-            <w:tcW w:w="1568" w:type="dxa"/>
+            <w:tcW w:w="2268" w:type="dxa"/>
             <w:tcBorders>
               <w:top w:val="none"/>
               <w:left w:val="none"/>
@@ -322,7 +323,7 @@
         </w:tc>
         <w:tc>
           <w:tcPr>
-            <w:tcW w:w="2228" w:type="dxa"/>
+            <w:tcW w:w="2268" w:type="dxa"/>
             <w:tcBorders>
               <w:top w:val="none"/>
               <w:left w:val="none"/>
@@ -356,7 +357,7 @@
         </w:tc>
         <w:tc>
           <w:tcPr>
-            <w:tcW w:w="2040" w:type="dxa"/>
+            <w:tcW w:w="1984" w:type="dxa"/>
             <w:tcBorders>
               <w:top w:val="none"/>
               <w:left w:val="none"/>
@@ -392,7 +393,7 @@
       <w:tr>
         <w:tc>
           <w:tcPr>
-            <w:tcW w:w="3800" w:type="dxa"/>
+            <w:tcW w:w="3118" w:type="dxa"/>
             <w:tcBorders>
               <w:top w:val="none"/>
               <w:left w:val="none"/>
@@ -442,7 +443,7 @@
         </w:tc>
         <w:tc>
           <w:tcPr>
-            <w:tcW w:w="1568" w:type="dxa"/>
+            <w:tcW w:w="2268" w:type="dxa"/>
             <w:tcBorders>
               <w:top w:val="none"/>
               <w:left w:val="none"/>
@@ -474,7 +475,7 @@
         </w:tc>
         <w:tc>
           <w:tcPr>
-            <w:tcW w:w="2228" w:type="dxa"/>
+            <w:tcW w:w="2268" w:type="dxa"/>
             <w:tcBorders>
               <w:top w:val="none"/>
               <w:left w:val="none"/>
@@ -506,7 +507,7 @@
         </w:tc>
         <w:tc>
           <w:tcPr>
-            <w:tcW w:w="2040" w:type="dxa"/>
+            <w:tcW w:w="1984" w:type="dxa"/>
             <w:tcBorders>
               <w:top w:val="none"/>
               <w:left w:val="none"/>
@@ -631,6 +632,7 @@
         </w:tblBorders>
         <w:tblLook w:val="04A0" w:firstRow="1" w:lastRow="0" w:firstColumn="1" w:lastColumn="0" w:noHBand="0" w:noVBand="1"/>
         <w:jc w:val="center"/>
+        <w:tblLayout w:type="fixed"/>
       </w:tblPr>
       <w:tblGrid>
         <w:gridCol w:w="1702"/>
@@ -642,7 +644,7 @@
       <w:tr>
         <w:tc>
           <w:tcPr>
-            <w:tcW w:w="1702" w:type="dxa"/>
+            <w:tcW w:w="1984" w:type="dxa"/>
             <w:tcBorders>
               <w:top w:val="none"/>
               <w:left w:val="none"/>
@@ -676,7 +678,7 @@
         </w:tc>
         <w:tc>
           <w:tcPr>
-            <w:tcW w:w="1222" w:type="dxa"/>
+            <w:tcW w:w="1417" w:type="dxa"/>
             <w:tcBorders>
               <w:top w:val="none"/>
               <w:left w:val="none"/>
@@ -710,7 +712,7 @@
         </w:tc>
         <w:tc>
           <w:tcPr>
-            <w:tcW w:w="828" w:type="dxa"/>
+            <w:tcW w:w="1417" w:type="dxa"/>
             <w:tcBorders>
               <w:top w:val="none"/>
               <w:left w:val="none"/>
@@ -744,7 +746,7 @@
         </w:tc>
         <w:tc>
           <w:tcPr>
-            <w:tcW w:w="4883" w:type="dxa"/>
+            <w:tcW w:w="3685" w:type="dxa"/>
             <w:tcBorders>
               <w:top w:val="none"/>
               <w:left w:val="none"/>
@@ -778,7 +780,7 @@
         </w:tc>
         <w:tc>
           <w:tcPr>
-            <w:tcW w:w="1000" w:type="dxa"/>
+            <w:tcW w:w="1134" w:type="dxa"/>
             <w:tcBorders>
               <w:top w:val="none"/>
               <w:left w:val="none"/>
@@ -814,7 +816,7 @@
       <w:tr>
         <w:tc>
           <w:tcPr>
-            <w:tcW w:w="1702" w:type="dxa"/>
+            <w:tcW w:w="1984" w:type="dxa"/>
             <w:tcBorders>
               <w:top w:val="none"/>
               <w:left w:val="none"/>
@@ -846,7 +848,7 @@
         </w:tc>
         <w:tc>
           <w:tcPr>
-            <w:tcW w:w="1222" w:type="dxa"/>
+            <w:tcW w:w="1417" w:type="dxa"/>
             <w:tcBorders>
               <w:top w:val="none"/>
               <w:left w:val="none"/>
@@ -878,7 +880,7 @@
         </w:tc>
         <w:tc>
           <w:tcPr>
-            <w:tcW w:w="828" w:type="dxa"/>
+            <w:tcW w:w="1417" w:type="dxa"/>
             <w:tcBorders>
               <w:top w:val="none"/>
               <w:left w:val="none"/>
@@ -910,7 +912,7 @@
         </w:tc>
         <w:tc>
           <w:tcPr>
-            <w:tcW w:w="4883" w:type="dxa"/>
+            <w:tcW w:w="3685" w:type="dxa"/>
             <w:tcBorders>
               <w:top w:val="none"/>
               <w:left w:val="none"/>
@@ -939,7 +941,7 @@
         </w:tc>
         <w:tc>
           <w:tcPr>
-            <w:tcW w:w="1000" w:type="dxa"/>
+            <w:tcW w:w="1134" w:type="dxa"/>
             <w:tcBorders>
               <w:top w:val="none"/>
               <w:left w:val="none"/>
@@ -1064,6 +1066,7 @@
         </w:tblBorders>
         <w:tblLook w:val="04A0" w:firstRow="1" w:lastRow="0" w:firstColumn="1" w:lastColumn="0" w:noHBand="0" w:noVBand="1"/>
         <w:jc w:val="center"/>
+        <w:tblLayout w:type="fixed"/>
       </w:tblPr>
       <w:tblGrid>
         <w:gridCol w:w="3800"/>
@@ -1073,7 +1076,7 @@
       <w:tr>
         <w:tc>
           <w:tcPr>
-            <w:tcW w:w="3800" w:type="dxa"/>
+            <w:tcW w:w="3685" w:type="dxa"/>
             <w:tcBorders>
               <w:top w:val="none"/>
               <w:left w:val="none"/>
@@ -1107,7 +1110,7 @@
         </w:tc>
         <w:tc>
           <w:tcPr>
-            <w:tcW w:w="3000" w:type="dxa"/>
+            <w:tcW w:w="3402" w:type="dxa"/>
             <w:tcBorders>
               <w:top w:val="none"/>
               <w:left w:val="none"/>
@@ -1141,7 +1144,7 @@
         </w:tc>
         <w:tc>
           <w:tcPr>
-            <w:tcW w:w="2838" w:type="dxa"/>
+            <w:tcW w:w="2551" w:type="dxa"/>
             <w:tcBorders>
               <w:top w:val="none"/>
               <w:left w:val="none"/>
@@ -1177,7 +1180,7 @@
       <w:tr>
         <w:tc>
           <w:tcPr>
-            <w:tcW w:w="3800" w:type="dxa"/>
+            <w:tcW w:w="3685" w:type="dxa"/>
             <w:tcBorders>
               <w:top w:val="none"/>
               <w:left w:val="none"/>
@@ -1209,7 +1212,7 @@
         </w:tc>
         <w:tc>
           <w:tcPr>
-            <w:tcW w:w="3000" w:type="dxa"/>
+            <w:tcW w:w="3402" w:type="dxa"/>
             <w:tcBorders>
               <w:top w:val="none"/>
               <w:left w:val="none"/>
@@ -1241,7 +1244,7 @@
         </w:tc>
         <w:tc>
           <w:tcPr>
-            <w:tcW w:w="2838" w:type="dxa"/>
+            <w:tcW w:w="2551" w:type="dxa"/>
             <w:tcBorders>
               <w:top w:val="none"/>
               <w:left w:val="none"/>
@@ -1366,6 +1369,7 @@
         </w:tblBorders>
         <w:tblLook w:val="04A0" w:firstRow="1" w:lastRow="0" w:firstColumn="1" w:lastColumn="0" w:noHBand="0" w:noVBand="1"/>
         <w:jc w:val="center"/>
+        <w:tblLayout w:type="fixed"/>
       </w:tblPr>
       <w:tblGrid>
         <w:gridCol w:w="3500"/>
@@ -1376,7 +1380,7 @@
         <w:trPr/>
         <w:tc>
           <w:tcPr>
-            <w:tcW w:w="3500" w:type="dxa"/>
+            <w:tcW w:w="2551" w:type="dxa"/>
             <w:tcBorders>
               <w:top w:val="none"/>
               <w:left w:val="none"/>
@@ -1410,7 +1414,7 @@
         </w:tc>
         <w:tc>
           <w:tcPr>
-            <w:tcW w:w="4138" w:type="dxa"/>
+            <w:tcW w:w="4819" w:type="dxa"/>
             <w:tcBorders>
               <w:top w:val="none"/>
               <w:left w:val="none"/>
@@ -1444,7 +1448,7 @@
         </w:tc>
         <w:tc>
           <w:tcPr>
-            <w:tcW w:w="2000" w:type="dxa"/>
+            <w:tcW w:w="2268" w:type="dxa"/>
             <w:tcBorders>
               <w:top w:val="none"/>
               <w:left w:val="none"/>
@@ -1481,7 +1485,7 @@
         <w:trPr/>
         <w:tc>
           <w:tcPr>
-            <w:tcW w:w="3500" w:type="dxa"/>
+            <w:tcW w:w="2551" w:type="dxa"/>
             <w:tcBorders>
               <w:top w:val="none"/>
               <w:left w:val="none"/>
@@ -1513,7 +1517,7 @@
         </w:tc>
         <w:tc>
           <w:tcPr>
-            <w:tcW w:w="4138" w:type="dxa"/>
+            <w:tcW w:w="4819" w:type="dxa"/>
             <w:tcBorders>
               <w:top w:val="none"/>
               <w:left w:val="none"/>
@@ -1545,7 +1549,7 @@
         </w:tc>
         <w:tc>
           <w:tcPr>
-            <w:tcW w:w="2000" w:type="dxa"/>
+            <w:tcW w:w="2268" w:type="dxa"/>
             <w:tcBorders>
               <w:top w:val="none"/>
               <w:left w:val="none"/>
@@ -1670,6 +1674,7 @@
         </w:tblBorders>
         <w:tblLook w:val="04A0" w:firstRow="1" w:lastRow="0" w:firstColumn="1" w:lastColumn="0" w:noHBand="0" w:noVBand="1"/>
         <w:jc w:val="center"/>
+        <w:tblLayout w:type="fixed"/>
       </w:tblPr>
       <w:tblGrid>
         <w:gridCol w:w="1405"/>
@@ -1681,7 +1686,7 @@
         <w:trPr/>
         <w:tc>
           <w:tcPr>
-            <w:tcW w:w="1405" w:type="dxa"/>
+            <w:tcW w:w="2268" w:type="dxa"/>
             <w:tcBorders>
               <w:top w:val="none"/>
               <w:left w:val="none"/>
@@ -1712,7 +1717,7 @@
         </w:tc>
         <w:tc>
           <w:tcPr>
-            <w:tcW w:w="1777" w:type="dxa"/>
+            <w:tcW w:w="1984" w:type="dxa"/>
             <w:tcBorders>
               <w:top w:val="none"/>
               <w:left w:val="none"/>
@@ -1743,7 +1748,7 @@
         </w:tc>
         <w:tc>
           <w:tcPr>
-            <w:tcW w:w="1262" w:type="dxa"/>
+            <w:tcW w:w="1701" w:type="dxa"/>
             <w:tcBorders>
               <w:top w:val="none"/>
               <w:left w:val="none"/>
@@ -1774,7 +1779,7 @@
         </w:tc>
         <w:tc>
           <w:tcPr>
-            <w:tcW w:w="5192" w:type="dxa"/>
+            <w:tcW w:w="3685" w:type="dxa"/>
             <w:tcBorders>
               <w:top w:val="none"/>
               <w:left w:val="none"/>
@@ -1808,7 +1813,7 @@
         <w:trPr/>
         <w:tc>
           <w:tcPr>
-            <w:tcW w:w="1405" w:type="dxa"/>
+            <w:tcW w:w="2268" w:type="dxa"/>
             <w:tcBorders>
               <w:top w:val="none"/>
               <w:left w:val="none"/>
@@ -1837,7 +1842,7 @@
         </w:tc>
         <w:tc>
           <w:tcPr>
-            <w:tcW w:w="1777" w:type="dxa"/>
+            <w:tcW w:w="1984" w:type="dxa"/>
             <w:tcBorders>
               <w:top w:val="none"/>
               <w:left w:val="none"/>
@@ -1866,7 +1871,7 @@
         </w:tc>
         <w:tc>
           <w:tcPr>
-            <w:tcW w:w="1262" w:type="dxa"/>
+            <w:tcW w:w="1701" w:type="dxa"/>
             <w:tcBorders>
               <w:top w:val="none"/>
               <w:left w:val="none"/>
@@ -1895,7 +1900,7 @@
         </w:tc>
         <w:tc>
           <w:tcPr>
-            <w:tcW w:w="5192" w:type="dxa"/>
+            <w:tcW w:w="3685" w:type="dxa"/>
             <w:tcBorders>
               <w:top w:val="none"/>
               <w:left w:val="none"/>

</xml_diff>